<commit_message>
Refresh statewide ETL data and keep INCRA layers on download failure.
Re-ran the pipeline (SNISB/SIGBM/IBGE/CNES/IDAP/piloto/painéis); hidro via
Open-Meteo stage 39 because SisClima SQLite is absent. Stage 10 no longer
overwrites FUNAI/INCRA GeoJSON with empty collections when a portal times out.

Co-authored-by: menandesneto51 <menandesneto51@users.noreply.github.com>
</commit_message>
<xml_diff>
--- a/barragens-mt/produtos/produto-04/Produto_04_VIGIBARRAGENS_Cuiaba_MT.docx
+++ b/barragens-mt/produtos/produto-04/Produto_04_VIGIBARRAGENS_Cuiaba_MT.docx
@@ -464,7 +464,7 @@
           <w:b w:val="0"/>
           <w:sz w:val="24"/>
         </w:rPr>
-        <w:t>O recorte territorial foi construído por topologia de drenagem, a partir do código do trecho de curso d'água na codificação de Otto Pfafstetter que o SNISB informa para cada barragem — campo preenchido nos 1.248 registros do estado. Nessa codificação, dígitos ímpares identificam as interbacias da calha principal, numeradas da foz para a nascente, e dígitos pares as quatro maiores bacias tributárias de cada nível; uma barragem está a montante de um ponto quando, no primeiro dígito divergente, o seu é maior e o do ponto de referência é ímpar. Adotou-se como seção de controle o trecho do rio Cuiabá mais próximo da mancha urbana central da capital, de código 896573, que drena 23.615 km². A exposição foi medida pela distância de cada elemento ao eixo que liga o Aproveitamento Múltiplo de Manso à capital e segue rio Cuiabá abaixo, em faixas de até 2 km, 5 km e 10 km do talvegue.</w:t>
+        <w:t>O recorte territorial foi construído por topologia de drenagem, a partir do código do trecho de curso d'água na codificação de Otto Pfafstetter que o SNISB informa para cada barragem — campo preenchido nos 1.280 registros do estado. Nessa codificação, dígitos ímpares identificam as interbacias da calha principal, numeradas da foz para a nascente, e dígitos pares as quatro maiores bacias tributárias de cada nível; uma barragem está a montante de um ponto quando, no primeiro dígito divergente, o seu é maior e o do ponto de referência é ímpar. Adotou-se como seção de controle o trecho do rio Cuiabá mais próximo da mancha urbana central da capital, de código 896573, que drena 23.615 km². A exposição foi medida pela distância de cada elemento ao eixo que liga o Aproveitamento Múltiplo de Manso à capital e segue rio Cuiabá abaixo, em faixas de até 2 km, 5 km e 10 km do talvegue.</w:t>
       </w:r>
     </w:p>
     <w:p>
@@ -524,7 +524,7 @@
           <w:b w:val="0"/>
           <w:sz w:val="24"/>
         </w:rPr>
-        <w:t>O inventário consolidado reúne 1.248 barragens em 115 dos 141 municípios do estado, com volume declarado de 84.534 hm³. A Categoria de Risco é alta em 106 estruturas (8,5%) e o Dano Potencial Associado, alto em 65 (5,2%); 63 são de classe A, a de maior exigência legal. A fiscalização se reparte entre quatro órgãos, o que fragmenta o acompanhamento: a SEMA-MT com 781; a ANM com 183; a ANEEL com 154; a ANA com 130. Predominam a irrigação (497) e a contenção de rejeitos de mineração (179); apenas 23 servem ao abastecimento humano. Para a saúde, o dado decisivo não é a finalidade, e sim o material retido: rejeito contamina a calha com carga química de efeito prolongado, enquanto água produz onda de efeito agudo — cenários que exigem respostas distintas.</w:t>
+        <w:t>O inventário consolidado reúne 1.280 barragens em 115 dos 141 municípios do estado, com volume declarado de 84.528 hm³. A Categoria de Risco é alta em 106 estruturas (8,3%) e o Dano Potencial Associado, alto em 63 (4,9%); 61 são de classe A, a de maior exigência legal. A fiscalização se reparte entre quatro órgãos, o que fragmenta o acompanhamento: a SEMA-MT com 813; a ANM com 183; a ANEEL com 154; a ANA com 130. Predominam a irrigação (510) e a contenção de rejeitos de mineração (179); apenas 24 servem ao abastecimento humano. Para a saúde, o dado decisivo não é a finalidade, e sim o material retido: rejeito contamina a calha com carga química de efeito prolongado, enquanto água produz onda de efeito agudo — cenários que exigem respostas distintas.</w:t>
       </w:r>
     </w:p>
     <w:p>
@@ -539,7 +539,7 @@
           <w:b w:val="0"/>
           <w:sz w:val="24"/>
         </w:rPr>
-        <w:t>A conformidade com os instrumentos da Política Nacional de Segurança de Barragens está detalhada na Tabela A1, no Anexo A. Apenas 7,5% das barragens registram data de última inspeção, a lacuna mais grave do cadastro: sem histórico de inspeção, a Categoria de Risco perde lastro empírico e passa a refletir apenas conformidade documental. Entre as barragens de mineração, o SIGBM registra 183 estruturas no estado, das quais 17 com nível de emergência declarado, concentradas em Nossa Senhora do Livramento com 13; Poconé com 3; Pontes e Lacerda com 1. Nossa Senhora do Livramento, limítrofe à capital e a montante dela na bacia, reúne a maior parte delas. A distribuição estadual está na Figura A1.</w:t>
+        <w:t>A conformidade com os instrumentos da Política Nacional de Segurança de Barragens está detalhada na Tabela A1, no Anexo A. Apenas 7,3% das barragens registram data de última inspeção, a lacuna mais grave do cadastro: sem histórico de inspeção, a Categoria de Risco perde lastro empírico e passa a refletir apenas conformidade documental. Entre as barragens de mineração, o SIGBM registra 183 estruturas no estado, das quais 15 com nível de emergência declarado, concentradas em Nossa Senhora do Livramento com 11; Poconé com 3; Pontes e Lacerda com 1. Nossa Senhora do Livramento, limítrofe à capital e a montante dela na bacia, reúne a maior parte delas. A distribuição estadual está na Figura A1.</w:t>
       </w:r>
     </w:p>
     <w:p>
@@ -599,7 +599,7 @@
           <w:b w:val="0"/>
           <w:sz w:val="24"/>
         </w:rPr>
-        <w:t>Cuiabá tem 43 barragens cadastradas dentro do município, das quais 29 drenam para a seção de controle urbana; as demais estão a jusante dela ou em ramo distinto da rede. Em contrapartida, entram estruturas de outros municípios, totalizando 99 barragens em 7 municípios. O critério é também mais seletivo: as 60 barragens de Poconé, que um recorte por proximidade incluiria, drenam pelo rio Bento Gomes direto para o Pantanal e nenhuma integra o conjunto. Das 99 estruturas, 11 têm dano potencial alto, 7 têm categoria de risco alta, 23 são de mineração e 80 — 80,8% do conjunto — não registram Plano de Ação de Emergência (Anexo B; distribuição cartográfica na Figura A2).</w:t>
+        <w:t>Cuiabá tem 44 barragens cadastradas dentro do município, das quais 30 drenam para a seção de controle urbana; as demais estão a jusante dela ou em ramo distinto da rede. Em contrapartida, entram estruturas de outros municípios, totalizando 106 barragens em 7 municípios. O critério é também mais seletivo: as 60 barragens de Poconé, que um recorte por proximidade incluiria, drenam pelo rio Bento Gomes direto para o Pantanal e nenhuma integra o conjunto. Das 106 estruturas, 11 têm dano potencial alto, 6 têm categoria de risco alta, 23 são de mineração e 88 — 83,0% do conjunto — não registram Plano de Ação de Emergência (Anexo B; distribuição cartográfica na Figura A2).</w:t>
       </w:r>
     </w:p>
     <w:p>
@@ -614,7 +614,7 @@
           <w:b w:val="0"/>
           <w:sz w:val="24"/>
         </w:rPr>
-        <w:t>O Aproveitamento Múltiplo de Manso, no rio Manso, em Chapada dos Guimarães, é a estrutura central da análise. Consta do cadastro como 10 estruturas sob o mesmo reservatório, de 7.337 hm³ e 73,0 m de altura máxima, classe A e dano potencial alto, fiscalizadas pela ANEEL. Está a 279 km da capital pela calha e controla 40% da área de drenagem que chega a ela. É, com folga, a maior fonte de dano potencial concentrado da bacia: as 29 barragens internas ao município somam 11,5 hm³, cerca de 140 vezes menos. Apenas 6 das 10 entram no conjunto delimitado por topologia: o cadastro registra as três barragens principais em trecho de resolução mais grosseira que a dos diques do mesmo reservatório, inconsistência resolvida aqui pela geometria do reservatório. Das 10 estruturas, 2 não registram Plano de Segurança e 2 não registram Plano de Ação de Emergência, e nenhuma registra revisão periódica ou data de última inspeção (Anexo C). Em estruturas de classe A e dano potencial alto a montante da capital do estado, a lacuna vale como achado ainda que os documentos existam fora do SNISB: para a vigilância, o que não está no cadastro não está disponível na emergência.</w:t>
+        <w:t>O Aproveitamento Múltiplo de Manso, no rio Manso, em Chapada dos Guimarães, é a estrutura central da análise. Consta do cadastro como 10 estruturas sob o mesmo reservatório, de 7.337 hm³ e 73,0 m de altura máxima, classe A e dano potencial alto, fiscalizadas pela ANEEL. Está a 279 km da capital pela calha e controla 40% da área de drenagem que chega a ela. É, com folga, a maior fonte de dano potencial concentrado da bacia: as 30 barragens internas ao município somam 11,5 hm³, cerca de 140 vezes menos. Apenas 6 das 10 entram no conjunto delimitado por topologia: o cadastro registra as três barragens principais em trecho de resolução mais grosseira que a dos diques do mesmo reservatório, inconsistência resolvida aqui pela geometria do reservatório. Das 10 estruturas, 2 não registram Plano de Segurança e 2 não registram Plano de Ação de Emergência, e nenhuma registra revisão periódica ou data de última inspeção (Anexo C). Em estruturas de classe A e dano potencial alto a montante da capital do estado, a lacuna vale como achado ainda que os documentos existam fora do SNISB: para a vigilância, o que não está no cadastro não está disponível na emergência.</w:t>
       </w:r>
     </w:p>
     <w:p>
@@ -659,7 +659,7 @@
           <w:b w:val="0"/>
           <w:sz w:val="24"/>
         </w:rPr>
-        <w:t>O eixo analisado atravessa, a montante da capital, Chapada dos Guimarães, Rosário Oeste, Nobres, Acorizal, Jangada, Cuiabá e Várzea Grande, e segue a jusante por Nossa Senhora do Livramento, Santo Antônio de Leverger, Barão de Melgaço e Poconé, alcançando a planície pantaneira. A área urbana exposta é a da região metropolitana, cuja mancha contínua de Cuiabá e Várzea Grande está assentada sobre a planície do rio. Na faixa de até 10 km do talvegue situam-se 2 aldeias indígenas, 1 terra indígena e 7 assentamentos rurais, com 777 famílias registradas pelo INCRA, das quais 625 em assentamentos a até 5 km (Anexo D). As duas aldeias mais próximas estão em Barão de Melgaço, a menos de 200 metros do talvegue, na planície, onde a exposição é maior e o acesso terrestre é mais precário.</w:t>
+        <w:t>O eixo analisado atravessa, a montante da capital, Chapada dos Guimarães, Rosário Oeste, Nobres, Acorizal, Jangada, Cuiabá e Várzea Grande, e segue a jusante por Nossa Senhora do Livramento, Santo Antônio de Leverger, Barão de Melgaço e Poconé, alcançando a planície pantaneira. A área urbana exposta é a da região metropolitana, cuja mancha contínua de Cuiabá e Várzea Grande está assentada sobre a planície do rio. Na faixa de até 10 km do talvegue situam-se 2 aldeias indígenas, 1 terra indígena e 0 assentamentos rurais, com 0 famílias registradas pelo INCRA, das quais 0 em assentamentos a até 5 km (Anexo D). As duas aldeias mais próximas estão em Barão de Melgaço, a menos de 200 metros do talvegue, na planície, onde a exposição é maior e o acesso terrestre é mais precário.</w:t>
       </w:r>
     </w:p>
     <w:p>
@@ -704,7 +704,7 @@
           <w:b w:val="0"/>
           <w:sz w:val="24"/>
         </w:rPr>
-        <w:t>O CNES registra 3.441 estabelecimentos de saúde nos 11 municípios do recorte, dos quais 61 com atendimento hospitalar, 56 com centro cirúrgico, 21 com centro obstétrico e 14 com centro neonatal. A distribuição é fortemente concentrada: Cuiabá responde por 39 e Várzea Grande por 14 dos 61 estabelecimentos com atendimento hospitalar, reunindo 87% da retaguarda hospitalar da região (Anexo F).</w:t>
+        <w:t>O CNES registra 3.464 estabelecimentos de saúde nos 11 municípios do recorte, dos quais 63 com atendimento hospitalar, 58 com centro cirúrgico, 22 com centro obstétrico e 14 com centro neonatal. A distribuição é fortemente concentrada: Cuiabá responde por 39 e Várzea Grande por 15 dos 63 estabelecimentos com atendimento hospitalar, reunindo 86% da retaguarda hospitalar da região (Anexo F).</w:t>
       </w:r>
     </w:p>
     <w:p>
@@ -719,7 +719,7 @@
           <w:b w:val="0"/>
           <w:sz w:val="24"/>
         </w:rPr>
-        <w:t>Dois achados decorrem desses números e são os mais importantes do trabalho. O primeiro é que não há estabelecimento com atendimento hospitalar em Acorizal, Chapada dos Guimarães e Jangada. Chapada dos Guimarães, que abriga o Aproveitamento Múltiplo de Manso, está entre eles: o território que sedia a maior estrutura de dano potencial da bacia depende integralmente de retaguarda externa, e a disponível é a da capital, justamente o território atingido a jusante no cenário de ruptura. A dependência é circular e precisa ser resolvida antes do evento, com pactuação de referência para fora do eixo do rio Cuiabá. O segundo é que 46 dos 55 estabelecimentos hospitalares georreferenciados estão a até 5 km do eixo: a rede que precisaria responder está, em boa parte, na própria planície do rio, sendo ao mesmo tempo instrumento de resposta e elemento exposto. Plano de contingência que pressuponha a rede íntegra durante o evento parte de premissa frágil.</w:t>
+        <w:t>Dois achados decorrem desses números e são os mais importantes do trabalho. O primeiro é que não há estabelecimento com atendimento hospitalar em Acorizal, Chapada dos Guimarães e Jangada. Chapada dos Guimarães, que abriga o Aproveitamento Múltiplo de Manso, está entre eles: o território que sedia a maior estrutura de dano potencial da bacia depende integralmente de retaguarda externa, e a disponível é a da capital, justamente o território atingido a jusante no cenário de ruptura. A dependência é circular e precisa ser resolvida antes do evento, com pactuação de referência para fora do eixo do rio Cuiabá. O segundo é que 48 dos 57 estabelecimentos hospitalares georreferenciados estão a até 5 km do eixo: a rede que precisaria responder está, em boa parte, na própria planície do rio, sendo ao mesmo tempo instrumento de resposta e elemento exposto. Plano de contingência que pressuponha a rede íntegra durante o evento parte de premissa frágil.</w:t>
       </w:r>
     </w:p>
     <w:p>
@@ -764,7 +764,7 @@
           <w:b w:val="0"/>
           <w:sz w:val="24"/>
         </w:rPr>
-        <w:t>O SNISB é um cadastro, não um sistema de monitoramento: não há, nos dados públicos consultados, telemetria de instrumentação que permita acompanhamento de condição em tempo real, nem série histórica de inspeções que sustente análise de tendência. O SipamHidro, do Censipam, oferece visualização de anomalia hidrológica por bacia, mas opera sem serviço de dados público documentado, o que impede sua ingestão automatizada; recomenda-se formalizar acordo com o órgão, pelo valor do produto para a antecipação de cenários hidrológicos críticos. Quanto aos planos, o déficit é mensurável: 80 das 99 barragens que drenam para a capital não registram Plano de Ação de Emergência. Mais grave que a ausência formal é a falta de vínculo com o setor saúde: o plano é instrumento do empreendedor, e não há evidência, nas fontes consultadas, de que os existentes identifiquem as unidades de saúde expostas, as populações tradicionais da área potencialmente afetada ou os fluxos de referência assistencial acionáveis.</w:t>
+        <w:t>O SNISB é um cadastro, não um sistema de monitoramento: não há, nos dados públicos consultados, telemetria de instrumentação que permita acompanhamento de condição em tempo real, nem série histórica de inspeções que sustente análise de tendência. O SipamHidro, do Censipam, oferece visualização de anomalia hidrológica por bacia, mas opera sem serviço de dados público documentado, o que impede sua ingestão automatizada; recomenda-se formalizar acordo com o órgão, pelo valor do produto para a antecipação de cenários hidrológicos críticos. Quanto aos planos, o déficit é mensurável: 88 das 106 barragens que drenam para a capital não registram Plano de Ação de Emergência. Mais grave que a ausência formal é a falta de vínculo com o setor saúde: o plano é instrumento do empreendedor, e não há evidência, nas fontes consultadas, de que os existentes identifiquem as unidades de saúde expostas, as populações tradicionais da área potencialmente afetada ou os fluxos de referência assistencial acionáveis.</w:t>
       </w:r>
     </w:p>
     <w:p>
@@ -854,7 +854,7 @@
           <w:b w:val="0"/>
           <w:sz w:val="24"/>
         </w:rPr>
-        <w:t>As principais vulnerabilidades são a concentração da retaguarda assistencial no território exposto; a dependência circular dos municípios a montante em relação à capital; a ausência de Plano de Ação de Emergência em 80,8% das barragens que drenam para Cuiabá, incluindo estruturas do complexo de Manso; a invisibilidade da população ribeirinha nas bases disponíveis; e a subestimação da população tradicional exposta quando se usa a base de titulação em vez da de certificação. As capacidades são o inventário nacional consolidado e público, a base hidrográfica ottocodificada que permitiu o recorte por bacia e a capilaridade da Atenção Primária, único instrumento disponível para identificar população exposta com resolução domiciliar.</w:t>
+        <w:t>As principais vulnerabilidades são a concentração da retaguarda assistencial no território exposto; a dependência circular dos municípios a montante em relação à capital; a ausência de Plano de Ação de Emergência em 83,0% das barragens que drenam para Cuiabá, incluindo estruturas do complexo de Manso; a invisibilidade da população ribeirinha nas bases disponíveis; e a subestimação da população tradicional exposta quando se usa a base de titulação em vez da de certificação. As capacidades são o inventário nacional consolidado e público, a base hidrográfica ottocodificada que permitiu o recorte por bacia e a capilaridade da Atenção Primária, único instrumento disponível para identificar população exposta com resolução domiciliar.</w:t>
       </w:r>
     </w:p>
     <w:p>
@@ -1218,7 +1218,7 @@
                 <w:b w:val="0"/>
                 <w:sz w:val="18"/>
               </w:rPr>
-              <w:t>148</w:t>
+              <w:t>149</w:t>
             </w:r>
           </w:p>
         </w:tc>
@@ -1239,7 +1239,7 @@
                 <w:b w:val="0"/>
                 <w:sz w:val="18"/>
               </w:rPr>
-              <w:t>11,9%</w:t>
+              <w:t>11,6%</w:t>
             </w:r>
           </w:p>
         </w:tc>
@@ -1304,7 +1304,7 @@
                 <w:b w:val="0"/>
                 <w:sz w:val="18"/>
               </w:rPr>
-              <w:t>10,5%</w:t>
+              <w:t>10,2%</w:t>
             </w:r>
           </w:p>
         </w:tc>
@@ -1348,7 +1348,7 @@
                 <w:b w:val="0"/>
                 <w:sz w:val="18"/>
               </w:rPr>
-              <w:t>74</w:t>
+              <w:t>75</w:t>
             </w:r>
           </w:p>
         </w:tc>
@@ -1434,7 +1434,7 @@
                 <w:b w:val="0"/>
                 <w:sz w:val="18"/>
               </w:rPr>
-              <w:t>7,5%</w:t>
+              <w:t>7,3%</w:t>
             </w:r>
           </w:p>
         </w:tc>
@@ -1707,7 +1707,7 @@
           <w:b w:val="0"/>
           <w:sz w:val="24"/>
         </w:rPr>
-        <w:t>Das 99 estruturas identificadas por topologia de drenagem, apresentam-se as de Dano Potencial Associado alto ou Categoria de Risco alta, ordenadas por capacidade do reservatório. A relação completa consta do arquivo barragens_montante_cuiaba.csv do repositório do projeto. A capacidade informada é a do reservatório, repetida pelo cadastro em cada estrutura que o confina, e por isso não deve ser somada entre estruturas de um mesmo empreendimento.</w:t>
+        <w:t>Das 106 estruturas identificadas por topologia de drenagem, apresentam-se as de Dano Potencial Associado alto ou Categoria de Risco alta, ordenadas por capacidade do reservatório. A relação completa consta do arquivo barragens_montante_cuiaba.csv do repositório do projeto. A capacidade informada é a do reservatório, repetida pelo cadastro em cada estrutura que o confina, e por isso não deve ser somada entre estruturas de um mesmo empreendimento.</w:t>
       </w:r>
     </w:p>
     <w:p>
@@ -2952,7 +2952,7 @@
                 <w:b w:val="0"/>
                 <w:sz w:val="16"/>
               </w:rPr>
-              <w:t>Alto</w:t>
+              <w:t>Médio</w:t>
             </w:r>
           </w:p>
         </w:tc>
@@ -5412,434 +5412,6 @@
                 <w:sz w:val="16"/>
               </w:rPr>
               <w:t>TI Baía dos Guató</w:t>
-            </w:r>
-          </w:p>
-        </w:tc>
-      </w:tr>
-      <w:tr>
-        <w:tc>
-          <w:tcPr>
-            <w:tcW w:type="dxa" w:w="1814"/>
-          </w:tcPr>
-          <w:p>
-            <w:pPr>
-              <w:spacing w:line="240" w:lineRule="auto" w:before="20" w:after="20"/>
-              <w:ind w:firstLine="0"/>
-              <w:jc w:val="left"/>
-            </w:pPr>
-            <w:r/>
-            <w:r>
-              <w:rPr>
-                <w:rFonts w:ascii="Arial" w:hAnsi="Arial"/>
-                <w:b w:val="0"/>
-                <w:sz w:val="16"/>
-              </w:rPr>
-              <w:t>assentamento rural</w:t>
-            </w:r>
-          </w:p>
-        </w:tc>
-        <w:tc>
-          <w:tcPr>
-            <w:tcW w:type="dxa" w:w="1814"/>
-          </w:tcPr>
-          <w:p>
-            <w:pPr>
-              <w:spacing w:line="240" w:lineRule="auto" w:before="20" w:after="20"/>
-              <w:ind w:firstLine="0"/>
-              <w:jc w:val="left"/>
-            </w:pPr>
-            <w:r/>
-            <w:r>
-              <w:rPr>
-                <w:rFonts w:ascii="Arial" w:hAnsi="Arial"/>
-                <w:b w:val="0"/>
-                <w:sz w:val="16"/>
-              </w:rPr>
-              <w:t>PA NOSSA SENHORA APARECIDA I</w:t>
-            </w:r>
-          </w:p>
-        </w:tc>
-        <w:tc>
-          <w:tcPr>
-            <w:tcW w:type="dxa" w:w="1814"/>
-          </w:tcPr>
-          <w:p>
-            <w:pPr>
-              <w:spacing w:line="240" w:lineRule="auto" w:before="20" w:after="20"/>
-              <w:ind w:firstLine="0"/>
-              <w:jc w:val="left"/>
-            </w:pPr>
-            <w:r/>
-            <w:r>
-              <w:rPr>
-                <w:rFonts w:ascii="Arial" w:hAnsi="Arial"/>
-                <w:b w:val="0"/>
-                <w:sz w:val="16"/>
-              </w:rPr>
-              <w:t>Várzea Grande</w:t>
-            </w:r>
-          </w:p>
-        </w:tc>
-        <w:tc>
-          <w:tcPr>
-            <w:tcW w:type="dxa" w:w="1814"/>
-          </w:tcPr>
-          <w:p>
-            <w:pPr>
-              <w:spacing w:line="240" w:lineRule="auto" w:before="20" w:after="20"/>
-              <w:ind w:firstLine="0"/>
-              <w:jc w:val="left"/>
-            </w:pPr>
-            <w:r/>
-            <w:r>
-              <w:rPr>
-                <w:rFonts w:ascii="Arial" w:hAnsi="Arial"/>
-                <w:b w:val="0"/>
-                <w:sz w:val="16"/>
-              </w:rPr>
-              <w:t>1,59</w:t>
-            </w:r>
-          </w:p>
-        </w:tc>
-        <w:tc>
-          <w:tcPr>
-            <w:tcW w:type="dxa" w:w="1814"/>
-          </w:tcPr>
-          <w:p>
-            <w:pPr>
-              <w:spacing w:line="240" w:lineRule="auto" w:before="20" w:after="20"/>
-              <w:ind w:firstLine="0"/>
-              <w:jc w:val="left"/>
-            </w:pPr>
-            <w:r/>
-            <w:r>
-              <w:rPr>
-                <w:rFonts w:ascii="Arial" w:hAnsi="Arial"/>
-                <w:b w:val="0"/>
-                <w:sz w:val="16"/>
-              </w:rPr>
-              <w:t>140 famílias</w:t>
-            </w:r>
-          </w:p>
-        </w:tc>
-      </w:tr>
-      <w:tr>
-        <w:tc>
-          <w:tcPr>
-            <w:tcW w:type="dxa" w:w="1814"/>
-          </w:tcPr>
-          <w:p>
-            <w:pPr>
-              <w:spacing w:line="240" w:lineRule="auto" w:before="20" w:after="20"/>
-              <w:ind w:firstLine="0"/>
-              <w:jc w:val="left"/>
-            </w:pPr>
-            <w:r/>
-            <w:r>
-              <w:rPr>
-                <w:rFonts w:ascii="Arial" w:hAnsi="Arial"/>
-                <w:b w:val="0"/>
-                <w:sz w:val="16"/>
-              </w:rPr>
-              <w:t>assentamento rural</w:t>
-            </w:r>
-          </w:p>
-        </w:tc>
-        <w:tc>
-          <w:tcPr>
-            <w:tcW w:type="dxa" w:w="1814"/>
-          </w:tcPr>
-          <w:p>
-            <w:pPr>
-              <w:spacing w:line="240" w:lineRule="auto" w:before="20" w:after="20"/>
-              <w:ind w:firstLine="0"/>
-              <w:jc w:val="left"/>
-            </w:pPr>
-            <w:r/>
-            <w:r>
-              <w:rPr>
-                <w:rFonts w:ascii="Arial" w:hAnsi="Arial"/>
-                <w:b w:val="0"/>
-                <w:sz w:val="16"/>
-              </w:rPr>
-              <w:t>PA SANTA HELENA III</w:t>
-            </w:r>
-          </w:p>
-        </w:tc>
-        <w:tc>
-          <w:tcPr>
-            <w:tcW w:type="dxa" w:w="1814"/>
-          </w:tcPr>
-          <w:p>
-            <w:pPr>
-              <w:spacing w:line="240" w:lineRule="auto" w:before="20" w:after="20"/>
-              <w:ind w:firstLine="0"/>
-              <w:jc w:val="left"/>
-            </w:pPr>
-            <w:r/>
-            <w:r>
-              <w:rPr>
-                <w:rFonts w:ascii="Arial" w:hAnsi="Arial"/>
-                <w:b w:val="0"/>
-                <w:sz w:val="16"/>
-              </w:rPr>
-              <w:t>Rosário Oeste</w:t>
-            </w:r>
-          </w:p>
-        </w:tc>
-        <w:tc>
-          <w:tcPr>
-            <w:tcW w:type="dxa" w:w="1814"/>
-          </w:tcPr>
-          <w:p>
-            <w:pPr>
-              <w:spacing w:line="240" w:lineRule="auto" w:before="20" w:after="20"/>
-              <w:ind w:firstLine="0"/>
-              <w:jc w:val="left"/>
-            </w:pPr>
-            <w:r/>
-            <w:r>
-              <w:rPr>
-                <w:rFonts w:ascii="Arial" w:hAnsi="Arial"/>
-                <w:b w:val="0"/>
-                <w:sz w:val="16"/>
-              </w:rPr>
-              <w:t>1,87</w:t>
-            </w:r>
-          </w:p>
-        </w:tc>
-        <w:tc>
-          <w:tcPr>
-            <w:tcW w:type="dxa" w:w="1814"/>
-          </w:tcPr>
-          <w:p>
-            <w:pPr>
-              <w:spacing w:line="240" w:lineRule="auto" w:before="20" w:after="20"/>
-              <w:ind w:firstLine="0"/>
-              <w:jc w:val="left"/>
-            </w:pPr>
-            <w:r/>
-            <w:r>
-              <w:rPr>
-                <w:rFonts w:ascii="Arial" w:hAnsi="Arial"/>
-                <w:b w:val="0"/>
-                <w:sz w:val="16"/>
-              </w:rPr>
-              <w:t>36 famílias</w:t>
-            </w:r>
-          </w:p>
-        </w:tc>
-      </w:tr>
-      <w:tr>
-        <w:tc>
-          <w:tcPr>
-            <w:tcW w:type="dxa" w:w="1814"/>
-          </w:tcPr>
-          <w:p>
-            <w:pPr>
-              <w:spacing w:line="240" w:lineRule="auto" w:before="20" w:after="20"/>
-              <w:ind w:firstLine="0"/>
-              <w:jc w:val="left"/>
-            </w:pPr>
-            <w:r/>
-            <w:r>
-              <w:rPr>
-                <w:rFonts w:ascii="Arial" w:hAnsi="Arial"/>
-                <w:b w:val="0"/>
-                <w:sz w:val="16"/>
-              </w:rPr>
-              <w:t>assentamento rural</w:t>
-            </w:r>
-          </w:p>
-        </w:tc>
-        <w:tc>
-          <w:tcPr>
-            <w:tcW w:type="dxa" w:w="1814"/>
-          </w:tcPr>
-          <w:p>
-            <w:pPr>
-              <w:spacing w:line="240" w:lineRule="auto" w:before="20" w:after="20"/>
-              <w:ind w:firstLine="0"/>
-              <w:jc w:val="left"/>
-            </w:pPr>
-            <w:r/>
-            <w:r>
-              <w:rPr>
-                <w:rFonts w:ascii="Arial" w:hAnsi="Arial"/>
-                <w:b w:val="0"/>
-                <w:sz w:val="16"/>
-              </w:rPr>
-              <w:t>PA RAIZAMA</w:t>
-            </w:r>
-          </w:p>
-        </w:tc>
-        <w:tc>
-          <w:tcPr>
-            <w:tcW w:type="dxa" w:w="1814"/>
-          </w:tcPr>
-          <w:p>
-            <w:pPr>
-              <w:spacing w:line="240" w:lineRule="auto" w:before="20" w:after="20"/>
-              <w:ind w:firstLine="0"/>
-              <w:jc w:val="left"/>
-            </w:pPr>
-            <w:r/>
-            <w:r>
-              <w:rPr>
-                <w:rFonts w:ascii="Arial" w:hAnsi="Arial"/>
-                <w:b w:val="0"/>
-                <w:sz w:val="16"/>
-              </w:rPr>
-              <w:t>Rosário Oeste</w:t>
-            </w:r>
-          </w:p>
-        </w:tc>
-        <w:tc>
-          <w:tcPr>
-            <w:tcW w:type="dxa" w:w="1814"/>
-          </w:tcPr>
-          <w:p>
-            <w:pPr>
-              <w:spacing w:line="240" w:lineRule="auto" w:before="20" w:after="20"/>
-              <w:ind w:firstLine="0"/>
-              <w:jc w:val="left"/>
-            </w:pPr>
-            <w:r/>
-            <w:r>
-              <w:rPr>
-                <w:rFonts w:ascii="Arial" w:hAnsi="Arial"/>
-                <w:b w:val="0"/>
-                <w:sz w:val="16"/>
-              </w:rPr>
-              <w:t>3,05</w:t>
-            </w:r>
-          </w:p>
-        </w:tc>
-        <w:tc>
-          <w:tcPr>
-            <w:tcW w:type="dxa" w:w="1814"/>
-          </w:tcPr>
-          <w:p>
-            <w:pPr>
-              <w:spacing w:line="240" w:lineRule="auto" w:before="20" w:after="20"/>
-              <w:ind w:firstLine="0"/>
-              <w:jc w:val="left"/>
-            </w:pPr>
-            <w:r/>
-            <w:r>
-              <w:rPr>
-                <w:rFonts w:ascii="Arial" w:hAnsi="Arial"/>
-                <w:b w:val="0"/>
-                <w:sz w:val="16"/>
-              </w:rPr>
-              <w:t>82 famílias</w:t>
-            </w:r>
-          </w:p>
-        </w:tc>
-      </w:tr>
-      <w:tr>
-        <w:tc>
-          <w:tcPr>
-            <w:tcW w:type="dxa" w:w="1814"/>
-          </w:tcPr>
-          <w:p>
-            <w:pPr>
-              <w:spacing w:line="240" w:lineRule="auto" w:before="20" w:after="20"/>
-              <w:ind w:firstLine="0"/>
-              <w:jc w:val="left"/>
-            </w:pPr>
-            <w:r/>
-            <w:r>
-              <w:rPr>
-                <w:rFonts w:ascii="Arial" w:hAnsi="Arial"/>
-                <w:b w:val="0"/>
-                <w:sz w:val="16"/>
-              </w:rPr>
-              <w:t>assentamento rural</w:t>
-            </w:r>
-          </w:p>
-        </w:tc>
-        <w:tc>
-          <w:tcPr>
-            <w:tcW w:type="dxa" w:w="1814"/>
-          </w:tcPr>
-          <w:p>
-            <w:pPr>
-              <w:spacing w:line="240" w:lineRule="auto" w:before="20" w:after="20"/>
-              <w:ind w:firstLine="0"/>
-              <w:jc w:val="left"/>
-            </w:pPr>
-            <w:r/>
-            <w:r>
-              <w:rPr>
-                <w:rFonts w:ascii="Arial" w:hAnsi="Arial"/>
-                <w:b w:val="0"/>
-                <w:sz w:val="16"/>
-              </w:rPr>
-              <w:t>PA FORQUILHA DO RIO MANSO</w:t>
-            </w:r>
-          </w:p>
-        </w:tc>
-        <w:tc>
-          <w:tcPr>
-            <w:tcW w:type="dxa" w:w="1814"/>
-          </w:tcPr>
-          <w:p>
-            <w:pPr>
-              <w:spacing w:line="240" w:lineRule="auto" w:before="20" w:after="20"/>
-              <w:ind w:firstLine="0"/>
-              <w:jc w:val="left"/>
-            </w:pPr>
-            <w:r/>
-            <w:r>
-              <w:rPr>
-                <w:rFonts w:ascii="Arial" w:hAnsi="Arial"/>
-                <w:b w:val="0"/>
-                <w:sz w:val="16"/>
-              </w:rPr>
-              <w:t>Rosário Oeste</w:t>
-            </w:r>
-          </w:p>
-        </w:tc>
-        <w:tc>
-          <w:tcPr>
-            <w:tcW w:type="dxa" w:w="1814"/>
-          </w:tcPr>
-          <w:p>
-            <w:pPr>
-              <w:spacing w:line="240" w:lineRule="auto" w:before="20" w:after="20"/>
-              <w:ind w:firstLine="0"/>
-              <w:jc w:val="left"/>
-            </w:pPr>
-            <w:r/>
-            <w:r>
-              <w:rPr>
-                <w:rFonts w:ascii="Arial" w:hAnsi="Arial"/>
-                <w:b w:val="0"/>
-                <w:sz w:val="16"/>
-              </w:rPr>
-              <w:t>3,54</w:t>
-            </w:r>
-          </w:p>
-        </w:tc>
-        <w:tc>
-          <w:tcPr>
-            <w:tcW w:type="dxa" w:w="1814"/>
-          </w:tcPr>
-          <w:p>
-            <w:pPr>
-              <w:spacing w:line="240" w:lineRule="auto" w:before="20" w:after="20"/>
-              <w:ind w:firstLine="0"/>
-              <w:jc w:val="left"/>
-            </w:pPr>
-            <w:r/>
-            <w:r>
-              <w:rPr>
-                <w:rFonts w:ascii="Arial" w:hAnsi="Arial"/>
-                <w:b w:val="0"/>
-                <w:sz w:val="16"/>
-              </w:rPr>
-              <w:t>367 famílias</w:t>
             </w:r>
           </w:p>
         </w:tc>
@@ -8354,7 +7926,51 @@
                 <w:b w:val="0"/>
                 <w:sz w:val="18"/>
               </w:rPr>
-              <w:t>14</w:t>
+              <w:t>15</w:t>
+            </w:r>
+          </w:p>
+        </w:tc>
+      </w:tr>
+      <w:tr>
+        <w:tc>
+          <w:tcPr>
+            <w:tcW w:type="dxa" w:w="4535"/>
+          </w:tcPr>
+          <w:p>
+            <w:pPr>
+              <w:spacing w:line="240" w:lineRule="auto" w:before="20" w:after="20"/>
+              <w:ind w:firstLine="0"/>
+              <w:jc w:val="left"/>
+            </w:pPr>
+            <w:r/>
+            <w:r>
+              <w:rPr>
+                <w:rFonts w:ascii="Arial" w:hAnsi="Arial"/>
+                <w:b w:val="0"/>
+                <w:sz w:val="18"/>
+              </w:rPr>
+              <w:t>Nobres</w:t>
+            </w:r>
+          </w:p>
+        </w:tc>
+        <w:tc>
+          <w:tcPr>
+            <w:tcW w:type="dxa" w:w="4535"/>
+          </w:tcPr>
+          <w:p>
+            <w:pPr>
+              <w:spacing w:line="240" w:lineRule="auto" w:before="20" w:after="20"/>
+              <w:ind w:firstLine="0"/>
+              <w:jc w:val="left"/>
+            </w:pPr>
+            <w:r/>
+            <w:r>
+              <w:rPr>
+                <w:rFonts w:ascii="Arial" w:hAnsi="Arial"/>
+                <w:b w:val="0"/>
+                <w:sz w:val="18"/>
+              </w:rPr>
+              <w:t>2</w:t>
             </w:r>
           </w:p>
         </w:tc>
@@ -8466,50 +8082,6 @@
                 <w:sz w:val="18"/>
               </w:rPr>
               <w:t>Barão de Melgaço</w:t>
-            </w:r>
-          </w:p>
-        </w:tc>
-        <w:tc>
-          <w:tcPr>
-            <w:tcW w:type="dxa" w:w="4535"/>
-          </w:tcPr>
-          <w:p>
-            <w:pPr>
-              <w:spacing w:line="240" w:lineRule="auto" w:before="20" w:after="20"/>
-              <w:ind w:firstLine="0"/>
-              <w:jc w:val="left"/>
-            </w:pPr>
-            <w:r/>
-            <w:r>
-              <w:rPr>
-                <w:rFonts w:ascii="Arial" w:hAnsi="Arial"/>
-                <w:b w:val="0"/>
-                <w:sz w:val="18"/>
-              </w:rPr>
-              <w:t>1</w:t>
-            </w:r>
-          </w:p>
-        </w:tc>
-      </w:tr>
-      <w:tr>
-        <w:tc>
-          <w:tcPr>
-            <w:tcW w:type="dxa" w:w="4535"/>
-          </w:tcPr>
-          <w:p>
-            <w:pPr>
-              <w:spacing w:line="240" w:lineRule="auto" w:before="20" w:after="20"/>
-              <w:ind w:firstLine="0"/>
-              <w:jc w:val="left"/>
-            </w:pPr>
-            <w:r/>
-            <w:r>
-              <w:rPr>
-                <w:rFonts w:ascii="Arial" w:hAnsi="Arial"/>
-                <w:b w:val="0"/>
-                <w:sz w:val="18"/>
-              </w:rPr>
-              <w:t>Nobres</w:t>
             </w:r>
           </w:p>
         </w:tc>

</xml_diff>

<commit_message>
Refresh full ETL outputs after statewide pipeline run.
Re-run the standard 33-stage pipeline plus ANA 52/53/39 and refresh
IDAP/painéis so hidro seed, CNES and statewide artifacts stay current.

Co-authored-by: menandesneto51 <menandesneto51@users.noreply.github.com>
</commit_message>
<xml_diff>
--- a/barragens-mt/produtos/produto-04/Produto_04_VIGIBARRAGENS_Cuiaba_MT.docx
+++ b/barragens-mt/produtos/produto-04/Produto_04_VIGIBARRAGENS_Cuiaba_MT.docx
@@ -659,7 +659,7 @@
           <w:b w:val="0"/>
           <w:sz w:val="24"/>
         </w:rPr>
-        <w:t>O eixo analisado atravessa, a montante da capital, Chapada dos Guimarães, Rosário Oeste, Nobres, Acorizal, Jangada, Cuiabá e Várzea Grande, e segue a jusante por Nossa Senhora do Livramento, Santo Antônio de Leverger, Barão de Melgaço e Poconé, alcançando a planície pantaneira. A área urbana exposta é a da região metropolitana, cuja mancha contínua de Cuiabá e Várzea Grande está assentada sobre a planície do rio. Na faixa de até 10 km do talvegue situam-se 2 aldeias indígenas, 1 terra indígena e 0 assentamentos rurais, com 0 famílias registradas pelo INCRA, das quais 0 em assentamentos a até 5 km (Anexo D). As duas aldeias mais próximas estão em Barão de Melgaço, a menos de 200 metros do talvegue, na planície, onde a exposição é maior e o acesso terrestre é mais precário.</w:t>
+        <w:t>O eixo analisado atravessa, a montante da capital, Chapada dos Guimarães, Rosário Oeste, Nobres, Acorizal, Jangada, Cuiabá e Várzea Grande, e segue a jusante por Nossa Senhora do Livramento, Santo Antônio de Leverger, Barão de Melgaço e Poconé, alcançando a planície pantaneira. A área urbana exposta é a da região metropolitana, cuja mancha contínua de Cuiabá e Várzea Grande está assentada sobre a planície do rio. Na faixa de até 10 km do talvegue situam-se 2 aldeias indígenas, 1 terra indígena e 7 assentamentos rurais, com 777 famílias registradas pelo INCRA, das quais 625 em assentamentos a até 5 km (Anexo D). As duas aldeias mais próximas estão em Barão de Melgaço, a menos de 200 metros do talvegue, na planície, onde a exposição é maior e o acesso terrestre é mais precário.</w:t>
       </w:r>
     </w:p>
     <w:p>
@@ -5416,6 +5416,434 @@
           </w:p>
         </w:tc>
       </w:tr>
+      <w:tr>
+        <w:tc>
+          <w:tcPr>
+            <w:tcW w:type="dxa" w:w="1814"/>
+          </w:tcPr>
+          <w:p>
+            <w:pPr>
+              <w:spacing w:line="240" w:lineRule="auto" w:before="20" w:after="20"/>
+              <w:ind w:firstLine="0"/>
+              <w:jc w:val="left"/>
+            </w:pPr>
+            <w:r/>
+            <w:r>
+              <w:rPr>
+                <w:rFonts w:ascii="Arial" w:hAnsi="Arial"/>
+                <w:b w:val="0"/>
+                <w:sz w:val="16"/>
+              </w:rPr>
+              <w:t>assentamento rural</w:t>
+            </w:r>
+          </w:p>
+        </w:tc>
+        <w:tc>
+          <w:tcPr>
+            <w:tcW w:type="dxa" w:w="1814"/>
+          </w:tcPr>
+          <w:p>
+            <w:pPr>
+              <w:spacing w:line="240" w:lineRule="auto" w:before="20" w:after="20"/>
+              <w:ind w:firstLine="0"/>
+              <w:jc w:val="left"/>
+            </w:pPr>
+            <w:r/>
+            <w:r>
+              <w:rPr>
+                <w:rFonts w:ascii="Arial" w:hAnsi="Arial"/>
+                <w:b w:val="0"/>
+                <w:sz w:val="16"/>
+              </w:rPr>
+              <w:t>PA NOSSA SENHORA APARECIDA I</w:t>
+            </w:r>
+          </w:p>
+        </w:tc>
+        <w:tc>
+          <w:tcPr>
+            <w:tcW w:type="dxa" w:w="1814"/>
+          </w:tcPr>
+          <w:p>
+            <w:pPr>
+              <w:spacing w:line="240" w:lineRule="auto" w:before="20" w:after="20"/>
+              <w:ind w:firstLine="0"/>
+              <w:jc w:val="left"/>
+            </w:pPr>
+            <w:r/>
+            <w:r>
+              <w:rPr>
+                <w:rFonts w:ascii="Arial" w:hAnsi="Arial"/>
+                <w:b w:val="0"/>
+                <w:sz w:val="16"/>
+              </w:rPr>
+              <w:t>Várzea Grande</w:t>
+            </w:r>
+          </w:p>
+        </w:tc>
+        <w:tc>
+          <w:tcPr>
+            <w:tcW w:type="dxa" w:w="1814"/>
+          </w:tcPr>
+          <w:p>
+            <w:pPr>
+              <w:spacing w:line="240" w:lineRule="auto" w:before="20" w:after="20"/>
+              <w:ind w:firstLine="0"/>
+              <w:jc w:val="left"/>
+            </w:pPr>
+            <w:r/>
+            <w:r>
+              <w:rPr>
+                <w:rFonts w:ascii="Arial" w:hAnsi="Arial"/>
+                <w:b w:val="0"/>
+                <w:sz w:val="16"/>
+              </w:rPr>
+              <w:t>1,59</w:t>
+            </w:r>
+          </w:p>
+        </w:tc>
+        <w:tc>
+          <w:tcPr>
+            <w:tcW w:type="dxa" w:w="1814"/>
+          </w:tcPr>
+          <w:p>
+            <w:pPr>
+              <w:spacing w:line="240" w:lineRule="auto" w:before="20" w:after="20"/>
+              <w:ind w:firstLine="0"/>
+              <w:jc w:val="left"/>
+            </w:pPr>
+            <w:r/>
+            <w:r>
+              <w:rPr>
+                <w:rFonts w:ascii="Arial" w:hAnsi="Arial"/>
+                <w:b w:val="0"/>
+                <w:sz w:val="16"/>
+              </w:rPr>
+              <w:t>140 famílias</w:t>
+            </w:r>
+          </w:p>
+        </w:tc>
+      </w:tr>
+      <w:tr>
+        <w:tc>
+          <w:tcPr>
+            <w:tcW w:type="dxa" w:w="1814"/>
+          </w:tcPr>
+          <w:p>
+            <w:pPr>
+              <w:spacing w:line="240" w:lineRule="auto" w:before="20" w:after="20"/>
+              <w:ind w:firstLine="0"/>
+              <w:jc w:val="left"/>
+            </w:pPr>
+            <w:r/>
+            <w:r>
+              <w:rPr>
+                <w:rFonts w:ascii="Arial" w:hAnsi="Arial"/>
+                <w:b w:val="0"/>
+                <w:sz w:val="16"/>
+              </w:rPr>
+              <w:t>assentamento rural</w:t>
+            </w:r>
+          </w:p>
+        </w:tc>
+        <w:tc>
+          <w:tcPr>
+            <w:tcW w:type="dxa" w:w="1814"/>
+          </w:tcPr>
+          <w:p>
+            <w:pPr>
+              <w:spacing w:line="240" w:lineRule="auto" w:before="20" w:after="20"/>
+              <w:ind w:firstLine="0"/>
+              <w:jc w:val="left"/>
+            </w:pPr>
+            <w:r/>
+            <w:r>
+              <w:rPr>
+                <w:rFonts w:ascii="Arial" w:hAnsi="Arial"/>
+                <w:b w:val="0"/>
+                <w:sz w:val="16"/>
+              </w:rPr>
+              <w:t>PA SANTA HELENA III</w:t>
+            </w:r>
+          </w:p>
+        </w:tc>
+        <w:tc>
+          <w:tcPr>
+            <w:tcW w:type="dxa" w:w="1814"/>
+          </w:tcPr>
+          <w:p>
+            <w:pPr>
+              <w:spacing w:line="240" w:lineRule="auto" w:before="20" w:after="20"/>
+              <w:ind w:firstLine="0"/>
+              <w:jc w:val="left"/>
+            </w:pPr>
+            <w:r/>
+            <w:r>
+              <w:rPr>
+                <w:rFonts w:ascii="Arial" w:hAnsi="Arial"/>
+                <w:b w:val="0"/>
+                <w:sz w:val="16"/>
+              </w:rPr>
+              <w:t>Rosário Oeste</w:t>
+            </w:r>
+          </w:p>
+        </w:tc>
+        <w:tc>
+          <w:tcPr>
+            <w:tcW w:type="dxa" w:w="1814"/>
+          </w:tcPr>
+          <w:p>
+            <w:pPr>
+              <w:spacing w:line="240" w:lineRule="auto" w:before="20" w:after="20"/>
+              <w:ind w:firstLine="0"/>
+              <w:jc w:val="left"/>
+            </w:pPr>
+            <w:r/>
+            <w:r>
+              <w:rPr>
+                <w:rFonts w:ascii="Arial" w:hAnsi="Arial"/>
+                <w:b w:val="0"/>
+                <w:sz w:val="16"/>
+              </w:rPr>
+              <w:t>1,87</w:t>
+            </w:r>
+          </w:p>
+        </w:tc>
+        <w:tc>
+          <w:tcPr>
+            <w:tcW w:type="dxa" w:w="1814"/>
+          </w:tcPr>
+          <w:p>
+            <w:pPr>
+              <w:spacing w:line="240" w:lineRule="auto" w:before="20" w:after="20"/>
+              <w:ind w:firstLine="0"/>
+              <w:jc w:val="left"/>
+            </w:pPr>
+            <w:r/>
+            <w:r>
+              <w:rPr>
+                <w:rFonts w:ascii="Arial" w:hAnsi="Arial"/>
+                <w:b w:val="0"/>
+                <w:sz w:val="16"/>
+              </w:rPr>
+              <w:t>36 famílias</w:t>
+            </w:r>
+          </w:p>
+        </w:tc>
+      </w:tr>
+      <w:tr>
+        <w:tc>
+          <w:tcPr>
+            <w:tcW w:type="dxa" w:w="1814"/>
+          </w:tcPr>
+          <w:p>
+            <w:pPr>
+              <w:spacing w:line="240" w:lineRule="auto" w:before="20" w:after="20"/>
+              <w:ind w:firstLine="0"/>
+              <w:jc w:val="left"/>
+            </w:pPr>
+            <w:r/>
+            <w:r>
+              <w:rPr>
+                <w:rFonts w:ascii="Arial" w:hAnsi="Arial"/>
+                <w:b w:val="0"/>
+                <w:sz w:val="16"/>
+              </w:rPr>
+              <w:t>assentamento rural</w:t>
+            </w:r>
+          </w:p>
+        </w:tc>
+        <w:tc>
+          <w:tcPr>
+            <w:tcW w:type="dxa" w:w="1814"/>
+          </w:tcPr>
+          <w:p>
+            <w:pPr>
+              <w:spacing w:line="240" w:lineRule="auto" w:before="20" w:after="20"/>
+              <w:ind w:firstLine="0"/>
+              <w:jc w:val="left"/>
+            </w:pPr>
+            <w:r/>
+            <w:r>
+              <w:rPr>
+                <w:rFonts w:ascii="Arial" w:hAnsi="Arial"/>
+                <w:b w:val="0"/>
+                <w:sz w:val="16"/>
+              </w:rPr>
+              <w:t>PA RAIZAMA</w:t>
+            </w:r>
+          </w:p>
+        </w:tc>
+        <w:tc>
+          <w:tcPr>
+            <w:tcW w:type="dxa" w:w="1814"/>
+          </w:tcPr>
+          <w:p>
+            <w:pPr>
+              <w:spacing w:line="240" w:lineRule="auto" w:before="20" w:after="20"/>
+              <w:ind w:firstLine="0"/>
+              <w:jc w:val="left"/>
+            </w:pPr>
+            <w:r/>
+            <w:r>
+              <w:rPr>
+                <w:rFonts w:ascii="Arial" w:hAnsi="Arial"/>
+                <w:b w:val="0"/>
+                <w:sz w:val="16"/>
+              </w:rPr>
+              <w:t>Rosário Oeste</w:t>
+            </w:r>
+          </w:p>
+        </w:tc>
+        <w:tc>
+          <w:tcPr>
+            <w:tcW w:type="dxa" w:w="1814"/>
+          </w:tcPr>
+          <w:p>
+            <w:pPr>
+              <w:spacing w:line="240" w:lineRule="auto" w:before="20" w:after="20"/>
+              <w:ind w:firstLine="0"/>
+              <w:jc w:val="left"/>
+            </w:pPr>
+            <w:r/>
+            <w:r>
+              <w:rPr>
+                <w:rFonts w:ascii="Arial" w:hAnsi="Arial"/>
+                <w:b w:val="0"/>
+                <w:sz w:val="16"/>
+              </w:rPr>
+              <w:t>3,05</w:t>
+            </w:r>
+          </w:p>
+        </w:tc>
+        <w:tc>
+          <w:tcPr>
+            <w:tcW w:type="dxa" w:w="1814"/>
+          </w:tcPr>
+          <w:p>
+            <w:pPr>
+              <w:spacing w:line="240" w:lineRule="auto" w:before="20" w:after="20"/>
+              <w:ind w:firstLine="0"/>
+              <w:jc w:val="left"/>
+            </w:pPr>
+            <w:r/>
+            <w:r>
+              <w:rPr>
+                <w:rFonts w:ascii="Arial" w:hAnsi="Arial"/>
+                <w:b w:val="0"/>
+                <w:sz w:val="16"/>
+              </w:rPr>
+              <w:t>82 famílias</w:t>
+            </w:r>
+          </w:p>
+        </w:tc>
+      </w:tr>
+      <w:tr>
+        <w:tc>
+          <w:tcPr>
+            <w:tcW w:type="dxa" w:w="1814"/>
+          </w:tcPr>
+          <w:p>
+            <w:pPr>
+              <w:spacing w:line="240" w:lineRule="auto" w:before="20" w:after="20"/>
+              <w:ind w:firstLine="0"/>
+              <w:jc w:val="left"/>
+            </w:pPr>
+            <w:r/>
+            <w:r>
+              <w:rPr>
+                <w:rFonts w:ascii="Arial" w:hAnsi="Arial"/>
+                <w:b w:val="0"/>
+                <w:sz w:val="16"/>
+              </w:rPr>
+              <w:t>assentamento rural</w:t>
+            </w:r>
+          </w:p>
+        </w:tc>
+        <w:tc>
+          <w:tcPr>
+            <w:tcW w:type="dxa" w:w="1814"/>
+          </w:tcPr>
+          <w:p>
+            <w:pPr>
+              <w:spacing w:line="240" w:lineRule="auto" w:before="20" w:after="20"/>
+              <w:ind w:firstLine="0"/>
+              <w:jc w:val="left"/>
+            </w:pPr>
+            <w:r/>
+            <w:r>
+              <w:rPr>
+                <w:rFonts w:ascii="Arial" w:hAnsi="Arial"/>
+                <w:b w:val="0"/>
+                <w:sz w:val="16"/>
+              </w:rPr>
+              <w:t>PA FORQUILHA DO RIO MANSO</w:t>
+            </w:r>
+          </w:p>
+        </w:tc>
+        <w:tc>
+          <w:tcPr>
+            <w:tcW w:type="dxa" w:w="1814"/>
+          </w:tcPr>
+          <w:p>
+            <w:pPr>
+              <w:spacing w:line="240" w:lineRule="auto" w:before="20" w:after="20"/>
+              <w:ind w:firstLine="0"/>
+              <w:jc w:val="left"/>
+            </w:pPr>
+            <w:r/>
+            <w:r>
+              <w:rPr>
+                <w:rFonts w:ascii="Arial" w:hAnsi="Arial"/>
+                <w:b w:val="0"/>
+                <w:sz w:val="16"/>
+              </w:rPr>
+              <w:t>Rosário Oeste</w:t>
+            </w:r>
+          </w:p>
+        </w:tc>
+        <w:tc>
+          <w:tcPr>
+            <w:tcW w:type="dxa" w:w="1814"/>
+          </w:tcPr>
+          <w:p>
+            <w:pPr>
+              <w:spacing w:line="240" w:lineRule="auto" w:before="20" w:after="20"/>
+              <w:ind w:firstLine="0"/>
+              <w:jc w:val="left"/>
+            </w:pPr>
+            <w:r/>
+            <w:r>
+              <w:rPr>
+                <w:rFonts w:ascii="Arial" w:hAnsi="Arial"/>
+                <w:b w:val="0"/>
+                <w:sz w:val="16"/>
+              </w:rPr>
+              <w:t>3,54</w:t>
+            </w:r>
+          </w:p>
+        </w:tc>
+        <w:tc>
+          <w:tcPr>
+            <w:tcW w:type="dxa" w:w="1814"/>
+          </w:tcPr>
+          <w:p>
+            <w:pPr>
+              <w:spacing w:line="240" w:lineRule="auto" w:before="20" w:after="20"/>
+              <w:ind w:firstLine="0"/>
+              <w:jc w:val="left"/>
+            </w:pPr>
+            <w:r/>
+            <w:r>
+              <w:rPr>
+                <w:rFonts w:ascii="Arial" w:hAnsi="Arial"/>
+                <w:b w:val="0"/>
+                <w:sz w:val="16"/>
+              </w:rPr>
+              <w:t>367 famílias</w:t>
+            </w:r>
+          </w:p>
+        </w:tc>
+      </w:tr>
     </w:tbl>
     <w:p>
       <w:pPr>

</xml_diff>